<commit_message>
sanitize repository identifiers and examples
</commit_message>
<xml_diff>
--- a/aladdin_monitor_technical.docx
+++ b/aladdin_monitor_technical.docx
@@ -203,7 +203,7 @@
         <w:rPr>
           <w:color w:val="888888"/>
         </w:rPr>
-        <w:t xml:space="preserve">Ofer </w:t>
+        <w:t xml:space="preserve">example-name </w:t>
       </w:r>
       <w:proofErr w:type="gramStart"/>
       <w:r>
@@ -217,7 +217,7 @@
         <w:rPr>
           <w:color w:val="888888"/>
         </w:rPr>
-        <w:t xml:space="preserve">  ofer@sw-eng.co.il</w:t>
+        <w:t xml:space="preserve">  user@example.com</w:t>
       </w:r>
     </w:p>
     <w:p>
@@ -262,7 +262,7 @@
         <w:spacing w:before="60" w:after="100"/>
       </w:pPr>
       <w:r>
-        <w:t xml:space="preserve">The Aladdin License Monitor is a web application that runs on SWCOMP99 — the Windows server hosting the physical Aladdin HASP HL USB dongle. It displays, in real time, which employees are currently consuming one of the 10 available seats of the Bentley </w:t>
+        <w:t xml:space="preserve">The Aladdin License Monitor is a web application that runs on example-host — the Windows server hosting the physical Aladdin HASP HL USB dongle. It displays, in real time, which employees are currently consuming one of the 10 available seats of the Bentley </w:t>
       </w:r>
       <w:proofErr w:type="spellStart"/>
       <w:r>
@@ -287,7 +287,7 @@
       </w:r>
       <w:proofErr w:type="spellEnd"/>
       <w:r>
-        <w:t>?") accessible from any machine on the local network at http://swcomp99:5000. It auto-refreshes every 30 seconds and shows each user's full name (from Active Directory), their workstation name, and IP address.</w:t>
+        <w:t>?") accessible from any machine on the local network at http://example-host:5000. It auto-refreshes every 30 seconds and shows each user's full name (from Active Directory), their workstation name, and IP address.</w:t>
       </w:r>
     </w:p>
     <w:p>
@@ -466,7 +466,7 @@
                 <w:sz w:val="20"/>
                 <w:szCs w:val="20"/>
               </w:rPr>
-              <w:t xml:space="preserve">SWCOMP99 (Windows, domain </w:t>
+              <w:t xml:space="preserve">example-host (Windows, domain </w:t>
             </w:r>
             <w:proofErr w:type="spellStart"/>
             <w:proofErr w:type="gramStart"/>
@@ -475,7 +475,7 @@
                 <w:sz w:val="20"/>
                 <w:szCs w:val="20"/>
               </w:rPr>
-              <w:t>sw.local</w:t>
+              <w:t>example.local</w:t>
             </w:r>
             <w:proofErr w:type="spellEnd"/>
             <w:proofErr w:type="gramEnd"/>
@@ -552,7 +552,7 @@
                 <w:sz w:val="20"/>
                 <w:szCs w:val="20"/>
               </w:rPr>
-              <w:t>DC01</w:t>
+              <w:t>example-dc</w:t>
             </w:r>
           </w:p>
         </w:tc>
@@ -620,7 +620,7 @@
                 <w:sz w:val="20"/>
                 <w:szCs w:val="20"/>
               </w:rPr>
-              <w:t>Aladdin HASP HL, Key ID 147558057</w:t>
+              <w:t>Aladdin HASP HL, Key ID 123456789</w:t>
             </w:r>
           </w:p>
         </w:tc>
@@ -986,7 +986,7 @@
                 <w:sz w:val="20"/>
                 <w:szCs w:val="20"/>
               </w:rPr>
-              <w:t>swadmin</w:t>
+              <w:t>example-user</w:t>
             </w:r>
             <w:proofErr w:type="spellEnd"/>
             <w:r>
@@ -1023,7 +1023,7 @@
         <w:spacing w:before="60" w:after="100"/>
       </w:pPr>
       <w:r>
-        <w:t>Two separate license manager processes run on SWCOMP99:</w:t>
+        <w:t>Two separate license manager processes run on example-host:</w:t>
       </w:r>
     </w:p>
     <w:p>
@@ -2185,7 +2185,7 @@
           <w:sz w:val="19"/>
           <w:szCs w:val="19"/>
         </w:rPr>
-        <w:t>46046,NAME</w:t>
+        <w:t>10001,NAME</w:t>
       </w:r>
       <w:proofErr w:type="gramEnd"/>
       <w:r>
@@ -2204,7 +2204,7 @@
         <w:spacing w:before="60" w:after="100"/>
       </w:pPr>
       <w:r>
-        <w:t>The server ID (46046) is dynamic — discovered at runtime, not the HASP key ID (147558057).</w:t>
+        <w:t>The server ID (10001) is dynamic — discovered at runtime, not the HASP key ID (123456789).</w:t>
       </w:r>
     </w:p>
     <w:p>
@@ -2267,7 +2267,7 @@
           <w:sz w:val="19"/>
           <w:szCs w:val="19"/>
         </w:rPr>
-        <w:t>46046  -&gt;  HS</w:t>
+        <w:t>10001  -&gt;  HS</w:t>
       </w:r>
       <w:proofErr w:type="gramEnd"/>
       <w:r>
@@ -2287,7 +2287,7 @@
           <w:sz w:val="19"/>
           <w:szCs w:val="19"/>
         </w:rPr>
-        <w:t>46046,MA</w:t>
+        <w:t>10001,MA</w:t>
       </w:r>
       <w:proofErr w:type="gramEnd"/>
       <w:r>
@@ -2420,7 +2420,7 @@
           <w:sz w:val="19"/>
           <w:szCs w:val="19"/>
         </w:rPr>
-        <w:t>46046,MA</w:t>
+        <w:t>10001,MA</w:t>
       </w:r>
       <w:proofErr w:type="gramEnd"/>
       <w:r>
@@ -2554,7 +2554,7 @@
           <w:sz w:val="19"/>
           <w:szCs w:val="19"/>
         </w:rPr>
-        <w:t>46046,MA</w:t>
+        <w:t>10001,MA</w:t>
       </w:r>
       <w:proofErr w:type="gramEnd"/>
       <w:r>
@@ -2634,7 +2634,7 @@
           <w:sz w:val="19"/>
           <w:szCs w:val="19"/>
         </w:rPr>
-        <w:t>46046,MA</w:t>
+        <w:t>10001,MA</w:t>
       </w:r>
       <w:proofErr w:type="gramEnd"/>
       <w:r>
@@ -2724,7 +2724,7 @@
           <w:sz w:val="19"/>
           <w:szCs w:val="19"/>
         </w:rPr>
-        <w:t>10.0.0.203)</w:t>
+        <w:t>198.51.100.203)</w:t>
       </w:r>
       <w:proofErr w:type="gramStart"/>
       <w:r>
@@ -2774,7 +2774,7 @@
           <w:sz w:val="19"/>
           <w:szCs w:val="19"/>
         </w:rPr>
-        <w:t>SWCOMP117.sw.local</w:t>
+        <w:t>example-client.example.local</w:t>
       </w:r>
       <w:proofErr w:type="gramEnd"/>
       <w:r>
@@ -3435,7 +3435,7 @@
       </w:r>
       <w:proofErr w:type="spellStart"/>
       <w:r>
-        <w:t>meirav</w:t>
+        <w:t>example-user</w:t>
       </w:r>
       <w:proofErr w:type="spellEnd"/>
       <w:r>
@@ -3466,7 +3466,7 @@
       </w:r>
       <w:proofErr w:type="spellEnd"/>
       <w:r>
-        <w:t>("SW\\username") queries DC01 for the DisplayName attribute using two methods:</w:t>
+        <w:t>("SW\\username") queries example-dc for the DisplayName attribute using two methods:</w:t>
       </w:r>
     </w:p>
     <w:p>
@@ -3487,7 +3487,7 @@
       </w:r>
       <w:proofErr w:type="spellEnd"/>
       <w:r>
-        <w:t xml:space="preserve"> -Server DC01 -Properties DisplayName (requires </w:t>
+        <w:t xml:space="preserve"> -Server example-dc -Properties DisplayName (requires </w:t>
       </w:r>
       <w:proofErr w:type="spellStart"/>
       <w:r>
@@ -3516,7 +3516,7 @@
       <w:proofErr w:type="spellEnd"/>
       <w:proofErr w:type="gramEnd"/>
       <w:r>
-        <w:t xml:space="preserve"> via LDAP://DC01 (pure .NET; works without the AD module)</w:t>
+        <w:t xml:space="preserve"> via LDAP://example-dc (pure .NET; works without the AD module)</w:t>
       </w:r>
     </w:p>
     <w:p>
@@ -3699,7 +3699,7 @@
       </w:r>
       <w:proofErr w:type="spellEnd"/>
       <w:r>
-        <w:t>("SW\\username") -&gt; queries DC01 -&gt; full Hebrew display name</w:t>
+        <w:t>("SW\\username") -&gt; queries example-dc -&gt; full Hebrew display name</w:t>
       </w:r>
     </w:p>
     <w:p>
@@ -4405,7 +4405,7 @@
                 <w:sz w:val="20"/>
                 <w:szCs w:val="20"/>
               </w:rPr>
-              <w:t>Ofer Aharon (C) 2026 | ofer@sw-eng.co.il</w:t>
+              <w:t>Example Name (C) 2026 | user@example.com</w:t>
             </w:r>
           </w:p>
         </w:tc>
@@ -4574,7 +4574,7 @@
           <w:sz w:val="19"/>
           <w:szCs w:val="19"/>
         </w:rPr>
-        <w:t>slot":"1","host_name":"SWCOMP117","ip":"10.0.0.203",</w:t>
+        <w:t>slot":"1","host_name":"example-client","ip":"198.51.100.203",</w:t>
       </w:r>
     </w:p>
     <w:p>
@@ -4635,7 +4635,7 @@
           <w:sz w:val="19"/>
           <w:szCs w:val="19"/>
         </w:rPr>
-        <w:t>meirav</w:t>
+        <w:t>example-user</w:t>
       </w:r>
       <w:proofErr w:type="spellEnd"/>
       <w:r>
@@ -4655,7 +4655,7 @@
           <w:sz w:val="19"/>
           <w:szCs w:val="19"/>
         </w:rPr>
-        <w:t>display_name":"Meirav</w:t>
+        <w:t>display_name":"example-user</w:t>
       </w:r>
       <w:proofErr w:type="spellEnd"/>
       <w:r>
@@ -5097,7 +5097,7 @@
                 <w:sz w:val="20"/>
                 <w:szCs w:val="20"/>
               </w:rPr>
-              <w:t>swadmin</w:t>
+              <w:t>example-user</w:t>
             </w:r>
             <w:proofErr w:type="spellEnd"/>
             <w:r>
@@ -7157,7 +7157,7 @@
                 <w:sz w:val="20"/>
                 <w:szCs w:val="20"/>
               </w:rPr>
-              <w:t xml:space="preserve"> License Manager (must be running on SWCOMP99)</w:t>
+              <w:t xml:space="preserve"> License Manager (must be running on example-host)</w:t>
             </w:r>
           </w:p>
         </w:tc>
@@ -7407,7 +7407,7 @@
       </w:r>
       <w:proofErr w:type="spellStart"/>
       <w:r>
-        <w:t>swadmin</w:t>
+        <w:t>example-user</w:t>
       </w:r>
       <w:proofErr w:type="spellEnd"/>
       <w:r>
@@ -7424,7 +7424,7 @@
         <w:spacing w:before="40" w:after="60"/>
       </w:pPr>
       <w:r>
-        <w:t xml:space="preserve">The HASP server ID (46046) is discovered </w:t>
+        <w:t xml:space="preserve">The HASP server ID (10001) is discovered </w:t>
       </w:r>
       <w:proofErr w:type="gramStart"/>
       <w:r>
@@ -7470,7 +7470,7 @@
           <w:sz w:val="18"/>
           <w:szCs w:val="18"/>
         </w:rPr>
-        <w:t xml:space="preserve">Ofer </w:t>
+        <w:t xml:space="preserve">example-name </w:t>
       </w:r>
       <w:proofErr w:type="gramStart"/>
       <w:r>
@@ -7497,7 +7497,7 @@
           <w:sz w:val="18"/>
           <w:szCs w:val="18"/>
         </w:rPr>
-        <w:t>ofer@sw-eng.co.il  |</w:t>
+        <w:t>user@example.com  |</w:t>
       </w:r>
       <w:proofErr w:type="gramEnd"/>
       <w:r>

</xml_diff>